<commit_message>
Updated trim to show long baseboard material
</commit_message>
<xml_diff>
--- a/Interior_Trim/interior_trim.docx
+++ b/Interior_Trim/interior_trim.docx
@@ -112,7 +112,18 @@
       </w:r>
     </w:p>
     <w:p>
-      <w:r>
+      <w:pPr>
+        <w:pStyle w:val="Heading3"/>
+      </w:pPr>
+      <w:bookmarkStart w:id="1" w:name="install-trim-in-the-following-order"/>
+      <w:r>
+        <w:t>  </w:t>
+      </w:r>
+      <w:r>
+        <w:rPr>
+          <w:b/>
+          <w:bCs/>
+        </w:rPr>
         <w:t>Install trim in the following order</w:t>
       </w:r>
     </w:p>
@@ -120,7 +131,8 @@
       <w:pPr>
         <w:pStyle w:val="Heading2"/>
       </w:pPr>
-      <w:bookmarkStart w:id="1" w:name="baseboards"/>
+      <w:bookmarkStart w:id="2" w:name="baseboards"/>
+      <w:bookmarkEnd w:id="1"/>
       <w:r>
         <w:t>Baseboards</w:t>
       </w:r>
@@ -133,7 +145,7 @@
         </w:numPr>
       </w:pPr>
       <w:r>
-        <w:t>Using long (8’ x 4”) white baseboards, start at the back of one side wall, nail in place to the side wall. Be sure that the baseboard rests on several spacers along its length, to assure an even gap above the finished floor.</w:t>
+        <w:t>Measure along a sidewall from back to front. Using long 4” white baseboards, cut a piece this length and nail in place to the side wall. Be sure that the baseboard rests on several spacers along its length, to assure an even gap above the finished floor.</w:t>
       </w:r>
     </w:p>
     <w:p>
@@ -144,19 +156,14 @@
         </w:numPr>
       </w:pPr>
       <w:r>
-        <w:t>When these baseboards are installed, measure from ends of each board to the front wall. Cut and nail another piece of baseboard (matching the top surface with long baseboard).</w:t>
-      </w:r>
-    </w:p>
-    <w:p>
-      <w:r>
-        <w:t>3 &amp; 4 Repeat 1 &amp; 2 on the other side wall.</w:t>
-      </w:r>
-    </w:p>
-    <w:p>
-      <w:pPr>
-        <w:numPr>
-          <w:ilvl w:val="0"/>
-          <w:numId w:val="5"/>
+        <w:t>Repeat on the other side wall.</w:t>
+      </w:r>
+    </w:p>
+    <w:p>
+      <w:pPr>
+        <w:numPr>
+          <w:ilvl w:val="0"/>
+          <w:numId w:val="4"/>
         </w:numPr>
       </w:pPr>
       <w:r>
@@ -175,16 +182,16 @@
         </w:rPr>
         <w:lastRenderedPageBreak/>
         <w:drawing>
-          <wp:inline distT="0" distB="0" distL="0" distR="0" wp14:anchorId="05EED242" wp14:editId="3604D730">
+          <wp:inline distT="0" distB="0" distL="0" distR="0" wp14:anchorId="592F58F5" wp14:editId="08749A88">
             <wp:extent cx="5943600" cy="8229600"/>
             <wp:effectExtent l="0" t="0" r="0" b="0"/>
-            <wp:docPr id="21" name="Picture"/>
+            <wp:docPr id="22" name="Picture"/>
             <wp:cNvGraphicFramePr/>
             <a:graphic xmlns:a="http://schemas.openxmlformats.org/drawingml/2006/main">
               <a:graphicData uri="http://schemas.openxmlformats.org/drawingml/2006/picture">
                 <pic:pic xmlns:pic="http://schemas.openxmlformats.org/drawingml/2006/picture">
                   <pic:nvPicPr>
-                    <pic:cNvPr id="22" name="Picture" descr="images/baseboards.png"/>
+                    <pic:cNvPr id="23" name="Picture" descr="images/baseboards.png"/>
                     <pic:cNvPicPr>
                       <a:picLocks noChangeAspect="1" noChangeArrowheads="1"/>
                     </pic:cNvPicPr>
@@ -221,8 +228,8 @@
       <w:pPr>
         <w:pStyle w:val="Heading2"/>
       </w:pPr>
-      <w:bookmarkStart w:id="2" w:name="rear-window-shelf"/>
-      <w:bookmarkEnd w:id="1"/>
+      <w:bookmarkStart w:id="3" w:name="rear-window-shelf"/>
+      <w:bookmarkEnd w:id="2"/>
       <w:r>
         <w:lastRenderedPageBreak/>
         <w:t>Rear Window Shelf</w:t>
@@ -237,7 +244,7 @@
       <w:pPr>
         <w:numPr>
           <w:ilvl w:val="0"/>
-          <w:numId w:val="6"/>
+          <w:numId w:val="5"/>
         </w:numPr>
       </w:pPr>
       <w:r>
@@ -248,7 +255,7 @@
       <w:pPr>
         <w:numPr>
           <w:ilvl w:val="0"/>
-          <w:numId w:val="6"/>
+          <w:numId w:val="5"/>
         </w:numPr>
       </w:pPr>
       <w:r>
@@ -259,7 +266,7 @@
       <w:pPr>
         <w:numPr>
           <w:ilvl w:val="0"/>
-          <w:numId w:val="6"/>
+          <w:numId w:val="5"/>
         </w:numPr>
       </w:pPr>
       <w:r>
@@ -280,7 +287,7 @@
       <w:pPr>
         <w:numPr>
           <w:ilvl w:val="0"/>
-          <w:numId w:val="6"/>
+          <w:numId w:val="5"/>
         </w:numPr>
       </w:pPr>
       <w:r>
@@ -288,14 +295,14 @@
       </w:r>
       <w:r>
         <w:br/>
-        <w:t>— subtract 1 inch from shelf width – ½” on each side</w:t>
-      </w:r>
-    </w:p>
-    <w:p>
-      <w:pPr>
-        <w:numPr>
-          <w:ilvl w:val="0"/>
-          <w:numId w:val="6"/>
+        <w:t>— subtract 1 inch from shelf width ( ½” on each side )</w:t>
+      </w:r>
+    </w:p>
+    <w:p>
+      <w:pPr>
+        <w:numPr>
+          <w:ilvl w:val="0"/>
+          <w:numId w:val="5"/>
         </w:numPr>
       </w:pPr>
       <w:r>
@@ -313,7 +320,7 @@
       <w:pPr>
         <w:numPr>
           <w:ilvl w:val="0"/>
-          <w:numId w:val="6"/>
+          <w:numId w:val="5"/>
         </w:numPr>
       </w:pPr>
       <w:r>
@@ -324,7 +331,7 @@
       <w:pPr>
         <w:numPr>
           <w:ilvl w:val="0"/>
-          <w:numId w:val="6"/>
+          <w:numId w:val="5"/>
         </w:numPr>
       </w:pPr>
       <w:r>
@@ -345,7 +352,7 @@
       <w:pPr>
         <w:numPr>
           <w:ilvl w:val="0"/>
-          <w:numId w:val="6"/>
+          <w:numId w:val="5"/>
         </w:numPr>
       </w:pPr>
       <w:r>
@@ -356,7 +363,7 @@
       <w:pPr>
         <w:numPr>
           <w:ilvl w:val="0"/>
-          <w:numId w:val="6"/>
+          <w:numId w:val="5"/>
         </w:numPr>
       </w:pPr>
       <w:r>
@@ -377,8 +384,8 @@
       <w:pPr>
         <w:pStyle w:val="Heading2"/>
       </w:pPr>
-      <w:bookmarkStart w:id="3" w:name="rear-window-trim"/>
-      <w:bookmarkEnd w:id="2"/>
+      <w:bookmarkStart w:id="4" w:name="rear-window-trim"/>
+      <w:bookmarkEnd w:id="3"/>
       <w:r>
         <w:t>Rear Window Trim</w:t>
       </w:r>
@@ -387,7 +394,7 @@
       <w:pPr>
         <w:numPr>
           <w:ilvl w:val="0"/>
-          <w:numId w:val="7"/>
+          <w:numId w:val="6"/>
         </w:numPr>
       </w:pPr>
       <w:r>
@@ -398,18 +405,18 @@
       <w:pPr>
         <w:numPr>
           <w:ilvl w:val="0"/>
-          <w:numId w:val="7"/>
-        </w:numPr>
-      </w:pPr>
-      <w:r>
-        <w:t>nail 1 piece to each side of the window opening, edge flush with wall. (2 nails at top, 1 every 8”, 2 at the bottom)</w:t>
-      </w:r>
-    </w:p>
-    <w:p>
-      <w:pPr>
-        <w:numPr>
-          <w:ilvl w:val="0"/>
-          <w:numId w:val="7"/>
+          <w:numId w:val="6"/>
+        </w:numPr>
+      </w:pPr>
+      <w:r>
+        <w:t>Nail 1 piece to each side of the window opening, edge flush with wall. (2 nails at top, 1 every 8”, 2 at the bottom)</w:t>
+      </w:r>
+    </w:p>
+    <w:p>
+      <w:pPr>
+        <w:numPr>
+          <w:ilvl w:val="0"/>
+          <w:numId w:val="6"/>
         </w:numPr>
       </w:pPr>
       <w:r>
@@ -420,7 +427,7 @@
       <w:pPr>
         <w:numPr>
           <w:ilvl w:val="0"/>
-          <w:numId w:val="7"/>
+          <w:numId w:val="6"/>
         </w:numPr>
       </w:pPr>
       <w:r>
@@ -431,7 +438,7 @@
       <w:pPr>
         <w:numPr>
           <w:ilvl w:val="0"/>
-          <w:numId w:val="7"/>
+          <w:numId w:val="6"/>
         </w:numPr>
       </w:pPr>
       <w:r>
@@ -450,16 +457,16 @@
         </w:rPr>
         <w:lastRenderedPageBreak/>
         <w:drawing>
-          <wp:inline distT="0" distB="0" distL="0" distR="0" wp14:anchorId="72C02287" wp14:editId="4FF989EE">
+          <wp:inline distT="0" distB="0" distL="0" distR="0" wp14:anchorId="7C58F99E" wp14:editId="7C6D14A9">
             <wp:extent cx="5943600" cy="8229600"/>
             <wp:effectExtent l="0" t="0" r="0" b="0"/>
-            <wp:docPr id="26" name="Picture"/>
+            <wp:docPr id="27" name="Picture"/>
             <wp:cNvGraphicFramePr/>
             <a:graphic xmlns:a="http://schemas.openxmlformats.org/drawingml/2006/main">
               <a:graphicData uri="http://schemas.openxmlformats.org/drawingml/2006/picture">
                 <pic:pic xmlns:pic="http://schemas.openxmlformats.org/drawingml/2006/picture">
                   <pic:nvPicPr>
-                    <pic:cNvPr id="27" name="Picture" descr="images/rear_window.png"/>
+                    <pic:cNvPr id="28" name="Picture" descr="images/rear_window.png"/>
                     <pic:cNvPicPr>
                       <a:picLocks noChangeAspect="1" noChangeArrowheads="1"/>
                     </pic:cNvPicPr>
@@ -496,8 +503,8 @@
       <w:pPr>
         <w:pStyle w:val="Heading2"/>
       </w:pPr>
-      <w:bookmarkStart w:id="4" w:name="top-trim-2-trim-boards"/>
-      <w:bookmarkEnd w:id="3"/>
+      <w:bookmarkStart w:id="5" w:name="top-trim-2-trim-boards"/>
+      <w:bookmarkEnd w:id="4"/>
       <w:r>
         <w:lastRenderedPageBreak/>
         <w:t>Top trim (2” trim boards)</w:t>
@@ -507,40 +514,40 @@
       <w:pPr>
         <w:numPr>
           <w:ilvl w:val="0"/>
+          <w:numId w:val="7"/>
+        </w:numPr>
+      </w:pPr>
+      <w:r>
+        <w:t>Start on the side walls at the back. Push the trim board up so it is tight against the ceiling. Nail</w:t>
+      </w:r>
+    </w:p>
+    <w:p>
+      <w:pPr>
+        <w:numPr>
+          <w:ilvl w:val="0"/>
+          <w:numId w:val="7"/>
+        </w:numPr>
+      </w:pPr>
+      <w:r>
+        <w:t>When back upper trim is installed, measure from end of that piece to the front wall. Cut and nail.</w:t>
+      </w:r>
+    </w:p>
+    <w:p>
+      <w:pPr>
+        <w:numPr>
+          <w:ilvl w:val="0"/>
+          <w:numId w:val="7"/>
+        </w:numPr>
+      </w:pPr>
+      <w:r>
+        <w:t>(&amp; 4) Repeat 1 &amp; 2 on the other wall</w:t>
+      </w:r>
+    </w:p>
+    <w:p>
+      <w:pPr>
+        <w:numPr>
+          <w:ilvl w:val="0"/>
           <w:numId w:val="8"/>
-        </w:numPr>
-      </w:pPr>
-      <w:r>
-        <w:t>Start on the side walls at the back. Push the trim board up so it is tight against the ceiling. Nail</w:t>
-      </w:r>
-    </w:p>
-    <w:p>
-      <w:pPr>
-        <w:numPr>
-          <w:ilvl w:val="0"/>
-          <w:numId w:val="8"/>
-        </w:numPr>
-      </w:pPr>
-      <w:r>
-        <w:t>When back upper trim is installed, measure from end of that piece to the front wall. Cut and nail.</w:t>
-      </w:r>
-    </w:p>
-    <w:p>
-      <w:pPr>
-        <w:numPr>
-          <w:ilvl w:val="0"/>
-          <w:numId w:val="8"/>
-        </w:numPr>
-      </w:pPr>
-      <w:r>
-        <w:t>(&amp; 4) Repeat 1 &amp; 2 on the other wall</w:t>
-      </w:r>
-    </w:p>
-    <w:p>
-      <w:pPr>
-        <w:numPr>
-          <w:ilvl w:val="0"/>
-          <w:numId w:val="9"/>
         </w:numPr>
       </w:pPr>
       <w:r>
@@ -567,16 +574,16 @@
         </w:rPr>
         <w:lastRenderedPageBreak/>
         <w:drawing>
-          <wp:inline distT="0" distB="0" distL="0" distR="0" wp14:anchorId="332D5716" wp14:editId="6D72C8D9">
+          <wp:inline distT="0" distB="0" distL="0" distR="0" wp14:anchorId="7FBE97BE" wp14:editId="4DD05A12">
             <wp:extent cx="5943600" cy="8229600"/>
             <wp:effectExtent l="0" t="0" r="0" b="0"/>
-            <wp:docPr id="30" name="Picture"/>
+            <wp:docPr id="31" name="Picture"/>
             <wp:cNvGraphicFramePr/>
             <a:graphic xmlns:a="http://schemas.openxmlformats.org/drawingml/2006/main">
               <a:graphicData uri="http://schemas.openxmlformats.org/drawingml/2006/picture">
                 <pic:pic xmlns:pic="http://schemas.openxmlformats.org/drawingml/2006/picture">
                   <pic:nvPicPr>
-                    <pic:cNvPr id="31" name="Picture" descr="images/top_trim.png"/>
+                    <pic:cNvPr id="32" name="Picture" descr="images/top_trim.png"/>
                     <pic:cNvPicPr>
                       <a:picLocks noChangeAspect="1" noChangeArrowheads="1"/>
                     </pic:cNvPicPr>
@@ -613,9 +620,9 @@
       <w:pPr>
         <w:pStyle w:val="Heading1"/>
       </w:pPr>
-      <w:bookmarkStart w:id="5" w:name="vertical-trim-2-trim-boards"/>
+      <w:bookmarkStart w:id="6" w:name="vertical-trim-2-trim-boards"/>
       <w:bookmarkEnd w:id="0"/>
-      <w:bookmarkEnd w:id="4"/>
+      <w:bookmarkEnd w:id="5"/>
       <w:r>
         <w:lastRenderedPageBreak/>
         <w:t>Vertical Trim (2” trim boards)</w:t>
@@ -625,7 +632,7 @@
       <w:pPr>
         <w:numPr>
           <w:ilvl w:val="0"/>
-          <w:numId w:val="10"/>
+          <w:numId w:val="9"/>
         </w:numPr>
       </w:pPr>
       <w:r>
@@ -643,7 +650,7 @@
       <w:pPr>
         <w:numPr>
           <w:ilvl w:val="0"/>
-          <w:numId w:val="10"/>
+          <w:numId w:val="9"/>
         </w:numPr>
       </w:pPr>
       <w:r>
@@ -654,7 +661,7 @@
       <w:pPr>
         <w:numPr>
           <w:ilvl w:val="0"/>
-          <w:numId w:val="10"/>
+          <w:numId w:val="9"/>
         </w:numPr>
       </w:pPr>
       <w:r>
@@ -683,16 +690,16 @@
         </w:rPr>
         <w:lastRenderedPageBreak/>
         <w:drawing>
-          <wp:inline distT="0" distB="0" distL="0" distR="0" wp14:anchorId="67900F36" wp14:editId="1CA4777E">
+          <wp:inline distT="0" distB="0" distL="0" distR="0" wp14:anchorId="4D1C3CBB" wp14:editId="4F52A3C1">
             <wp:extent cx="5943600" cy="8229600"/>
             <wp:effectExtent l="0" t="0" r="0" b="0"/>
-            <wp:docPr id="35" name="Picture"/>
+            <wp:docPr id="36" name="Picture"/>
             <wp:cNvGraphicFramePr/>
             <a:graphic xmlns:a="http://schemas.openxmlformats.org/drawingml/2006/main">
               <a:graphicData uri="http://schemas.openxmlformats.org/drawingml/2006/picture">
                 <pic:pic xmlns:pic="http://schemas.openxmlformats.org/drawingml/2006/picture">
                   <pic:nvPicPr>
-                    <pic:cNvPr id="36" name="Picture" descr="images/vertical_trim.png"/>
+                    <pic:cNvPr id="37" name="Picture" descr="images/vertical_trim.png"/>
                     <pic:cNvPicPr>
                       <a:picLocks noChangeAspect="1" noChangeArrowheads="1"/>
                     </pic:cNvPicPr>
@@ -729,8 +736,8 @@
       <w:pPr>
         <w:pStyle w:val="Heading1"/>
       </w:pPr>
-      <w:bookmarkStart w:id="6" w:name="horizontal-triangle-trim"/>
-      <w:bookmarkEnd w:id="5"/>
+      <w:bookmarkStart w:id="7" w:name="horizontal-triangle-trim"/>
+      <w:bookmarkEnd w:id="6"/>
       <w:r>
         <w:lastRenderedPageBreak/>
         <w:t>Horizontal &amp; Triangle Trim</w:t>
@@ -740,7 +747,7 @@
       <w:pPr>
         <w:pStyle w:val="Heading2"/>
       </w:pPr>
-      <w:bookmarkStart w:id="7" w:name="back-wall"/>
+      <w:bookmarkStart w:id="8" w:name="back-wall"/>
       <w:r>
         <w:t>Back wall</w:t>
       </w:r>
@@ -749,11 +756,65 @@
       <w:pPr>
         <w:numPr>
           <w:ilvl w:val="0"/>
+          <w:numId w:val="10"/>
+        </w:numPr>
+      </w:pPr>
+      <w:r>
+        <w:t>Measure from back corner vertical trim on one side to the other back corner vertical trim.</w:t>
+      </w:r>
+    </w:p>
+    <w:p>
+      <w:pPr>
+        <w:numPr>
+          <w:ilvl w:val="0"/>
+          <w:numId w:val="10"/>
+        </w:numPr>
+      </w:pPr>
+      <w:r>
+        <w:t>Cut a piece of 2” trim this length plus 1/16” for a snug fit.</w:t>
+      </w:r>
+    </w:p>
+    <w:p>
+      <w:pPr>
+        <w:numPr>
+          <w:ilvl w:val="0"/>
+          <w:numId w:val="10"/>
+        </w:numPr>
+      </w:pPr>
+      <w:r>
+        <w:t>Measure the height of the seam between upper and lower wall panels above floor, and mark each vertical trim at 1” below this dimension on both pieces in the corner</w:t>
+      </w:r>
+    </w:p>
+    <w:p>
+      <w:pPr>
+        <w:numPr>
+          <w:ilvl w:val="0"/>
+          <w:numId w:val="10"/>
+        </w:numPr>
+      </w:pPr>
+      <w:r>
+        <w:t>Line back wall trim piece up so that its bottom edge is on these marks, and nail in place</w:t>
+      </w:r>
+    </w:p>
+    <w:p>
+      <w:pPr>
+        <w:pStyle w:val="Heading2"/>
+      </w:pPr>
+      <w:bookmarkStart w:id="9" w:name="side-walls-at-the-back"/>
+      <w:bookmarkEnd w:id="8"/>
+      <w:r>
+        <w:t>Side walls at the back</w:t>
+      </w:r>
+    </w:p>
+    <w:p>
+      <w:pPr>
+        <w:numPr>
+          <w:ilvl w:val="0"/>
           <w:numId w:val="11"/>
         </w:numPr>
       </w:pPr>
       <w:r>
-        <w:t>Measure from back corner vertical trim on one side to the other back corner vertical trim.</w:t>
+        <w:t>Measure from the back corner trim to middle vertical trim (add 1/16” so it fits snugly), and cut 2” trim to this dimension</w:t>
       </w:r>
     </w:p>
     <w:p>
@@ -764,7 +825,7 @@
         </w:numPr>
       </w:pPr>
       <w:r>
-        <w:t>Cut a piece of 2” trim this length plus 1/16” for a snug fit.</w:t>
+        <w:t>Measure height of joint between upper and lower wall panels above floor, and mark vertical trim at 1” below this dimension on side wall.</w:t>
       </w:r>
     </w:p>
     <w:p>
@@ -775,28 +836,22 @@
         </w:numPr>
       </w:pPr>
       <w:r>
-        <w:t>Measure the height of the seam between upper and lower wall panels above floor, and mark each vertical trim at 1” below this dimension on both pieces in the corner</w:t>
-      </w:r>
-    </w:p>
-    <w:p>
-      <w:pPr>
-        <w:numPr>
-          <w:ilvl w:val="0"/>
-          <w:numId w:val="11"/>
-        </w:numPr>
-      </w:pPr>
-      <w:r>
-        <w:t>Line back wall trim piece up so that its bottom edge is on these marks, and nail in place</w:t>
+        <w:t>Line side wall trim piece up so that its bottom edge is on these marks, check that it lines up visually with the corresponding trim on the back wall, and nail in place.</w:t>
+      </w:r>
+    </w:p>
+    <w:p>
+      <w:r>
+        <w:t>Do NOT install mid-level horizontal trim between vertical trim and front wall. This will be done after Front Wall trim.</w:t>
       </w:r>
     </w:p>
     <w:p>
       <w:pPr>
         <w:pStyle w:val="Heading2"/>
       </w:pPr>
-      <w:bookmarkStart w:id="8" w:name="side-walls-at-the-back"/>
-      <w:bookmarkEnd w:id="7"/>
-      <w:r>
-        <w:t>Side walls at the back</w:t>
+      <w:bookmarkStart w:id="10" w:name="triangle-trim"/>
+      <w:bookmarkEnd w:id="9"/>
+      <w:r>
+        <w:t>Triangle trim</w:t>
       </w:r>
     </w:p>
     <w:p>
@@ -807,7 +862,7 @@
         </w:numPr>
       </w:pPr>
       <w:r>
-        <w:t>Measure from the back corner trim to middle vertical trim (add 1/16” so it fits snugly), and cut 2” trim to this dimension</w:t>
+        <w:t>Use precut pieces of 2” X 42” trim from the rack: 2 left, 2 right, 6 straight</w:t>
       </w:r>
     </w:p>
     <w:p>
@@ -818,7 +873,7 @@
         </w:numPr>
       </w:pPr>
       <w:r>
-        <w:t>Measure height of joint between upper and lower wall panels above floor, and mark vertical trim at 1” below this dimension on side wall.</w:t>
+        <w:t>position two angled pieces on the back wall and nail.</w:t>
       </w:r>
     </w:p>
     <w:p>
@@ -826,62 +881,6 @@
         <w:numPr>
           <w:ilvl w:val="0"/>
           <w:numId w:val="12"/>
-        </w:numPr>
-      </w:pPr>
-      <w:r>
-        <w:t>Line side wall trim piece up so that its bottom edge is on these marks, check that it lines up visually with the corresponding trim on the back wall, and nail in place.</w:t>
-      </w:r>
-    </w:p>
-    <w:p>
-      <w:r>
-        <w:t>Do NOT install mid-level horizontal trim between vertical trim and front wall. This will be done after Front Wall trim.</w:t>
-      </w:r>
-    </w:p>
-    <w:p>
-      <w:pPr>
-        <w:pStyle w:val="Heading2"/>
-      </w:pPr>
-      <w:bookmarkStart w:id="9" w:name="triangle-trim"/>
-      <w:bookmarkEnd w:id="8"/>
-      <w:r>
-        <w:t>Triangle trim</w:t>
-      </w:r>
-    </w:p>
-    <w:p>
-      <w:pPr>
-        <w:numPr>
-          <w:ilvl w:val="0"/>
-          <w:numId w:val="13"/>
-        </w:numPr>
-      </w:pPr>
-      <w:r>
-        <w:t xml:space="preserve">Use precut pieces of 2” X 42” trim from the rack: 2 </w:t>
-      </w:r>
-      <w:proofErr w:type="gramStart"/>
-      <w:r>
-        <w:t>left</w:t>
-      </w:r>
-      <w:proofErr w:type="gramEnd"/>
-      <w:r>
-        <w:t>, 2 right, 6 straight</w:t>
-      </w:r>
-    </w:p>
-    <w:p>
-      <w:pPr>
-        <w:numPr>
-          <w:ilvl w:val="0"/>
-          <w:numId w:val="13"/>
-        </w:numPr>
-      </w:pPr>
-      <w:r>
-        <w:t>position two angled pieces on the back wall and nail.</w:t>
-      </w:r>
-    </w:p>
-    <w:p>
-      <w:pPr>
-        <w:numPr>
-          <w:ilvl w:val="0"/>
-          <w:numId w:val="13"/>
         </w:numPr>
       </w:pPr>
       <w:r>
@@ -896,7 +895,7 @@
       <w:pPr>
         <w:numPr>
           <w:ilvl w:val="0"/>
-          <w:numId w:val="13"/>
+          <w:numId w:val="12"/>
         </w:numPr>
       </w:pPr>
       <w:r>
@@ -907,7 +906,7 @@
       <w:pPr>
         <w:numPr>
           <w:ilvl w:val="0"/>
-          <w:numId w:val="13"/>
+          <w:numId w:val="12"/>
         </w:numPr>
       </w:pPr>
       <w:r>
@@ -926,16 +925,16 @@
         </w:rPr>
         <w:lastRenderedPageBreak/>
         <w:drawing>
-          <wp:inline distT="0" distB="0" distL="0" distR="0" wp14:anchorId="6C88CD53" wp14:editId="5739DDF7">
+          <wp:inline distT="0" distB="0" distL="0" distR="0" wp14:anchorId="30610A71" wp14:editId="15DA5709">
             <wp:extent cx="5943600" cy="8229600"/>
             <wp:effectExtent l="0" t="0" r="0" b="0"/>
-            <wp:docPr id="41" name="Picture"/>
+            <wp:docPr id="42" name="Picture"/>
             <wp:cNvGraphicFramePr/>
             <a:graphic xmlns:a="http://schemas.openxmlformats.org/drawingml/2006/main">
               <a:graphicData uri="http://schemas.openxmlformats.org/drawingml/2006/picture">
                 <pic:pic xmlns:pic="http://schemas.openxmlformats.org/drawingml/2006/picture">
                   <pic:nvPicPr>
-                    <pic:cNvPr id="42" name="Picture" descr="images/horizontal_trim.png"/>
+                    <pic:cNvPr id="43" name="Picture" descr="images/horizontal_trim.png"/>
                     <pic:cNvPicPr>
                       <a:picLocks noChangeAspect="1" noChangeArrowheads="1"/>
                     </pic:cNvPicPr>
@@ -972,9 +971,9 @@
       <w:pPr>
         <w:pStyle w:val="Heading1"/>
       </w:pPr>
-      <w:bookmarkStart w:id="10" w:name="front-wall-shelf-and-window"/>
-      <w:bookmarkEnd w:id="6"/>
-      <w:bookmarkEnd w:id="9"/>
+      <w:bookmarkStart w:id="11" w:name="front-wall-shelf-and-window"/>
+      <w:bookmarkEnd w:id="7"/>
+      <w:bookmarkEnd w:id="10"/>
       <w:r>
         <w:lastRenderedPageBreak/>
         <w:t>Front Wall – Shelf and Window</w:t>
@@ -1008,7 +1007,7 @@
       <w:pPr>
         <w:numPr>
           <w:ilvl w:val="0"/>
-          <w:numId w:val="14"/>
+          <w:numId w:val="13"/>
         </w:numPr>
       </w:pPr>
       <w:r>
@@ -1019,7 +1018,7 @@
       <w:pPr>
         <w:numPr>
           <w:ilvl w:val="0"/>
-          <w:numId w:val="14"/>
+          <w:numId w:val="13"/>
         </w:numPr>
       </w:pPr>
       <w:r>
@@ -1030,7 +1029,7 @@
       <w:pPr>
         <w:numPr>
           <w:ilvl w:val="0"/>
-          <w:numId w:val="14"/>
+          <w:numId w:val="13"/>
         </w:numPr>
       </w:pPr>
       <w:r>
@@ -1041,7 +1040,7 @@
       <w:pPr>
         <w:numPr>
           <w:ilvl w:val="0"/>
-          <w:numId w:val="14"/>
+          <w:numId w:val="13"/>
         </w:numPr>
       </w:pPr>
       <w:r>
@@ -1062,7 +1061,7 @@
       <w:pPr>
         <w:numPr>
           <w:ilvl w:val="0"/>
-          <w:numId w:val="14"/>
+          <w:numId w:val="13"/>
         </w:numPr>
       </w:pPr>
       <w:r>
@@ -1073,26 +1072,18 @@
       <w:pPr>
         <w:numPr>
           <w:ilvl w:val="0"/>
-          <w:numId w:val="14"/>
-        </w:numPr>
-      </w:pPr>
-      <w:r>
-        <w:t xml:space="preserve">Place 2x4 under the shelf with </w:t>
-      </w:r>
-      <w:proofErr w:type="gramStart"/>
-      <w:r>
-        <w:t>4 inch</w:t>
-      </w:r>
-      <w:proofErr w:type="gramEnd"/>
-      <w:r>
-        <w:t xml:space="preserve"> side against the wall, flush with door side of the shelf and 1/2” shelf overhang on the side wall side</w:t>
-      </w:r>
-    </w:p>
-    <w:p>
-      <w:pPr>
-        <w:numPr>
-          <w:ilvl w:val="0"/>
-          <w:numId w:val="14"/>
+          <w:numId w:val="13"/>
+        </w:numPr>
+      </w:pPr>
+      <w:r>
+        <w:t>Place 2x4 under the shelf with 4 inch side against the wall, flush with door side of the shelf and 1/2” shelf overhang on the side wall side</w:t>
+      </w:r>
+    </w:p>
+    <w:p>
+      <w:pPr>
+        <w:numPr>
+          <w:ilvl w:val="0"/>
+          <w:numId w:val="13"/>
         </w:numPr>
       </w:pPr>
       <w:r>
@@ -1103,7 +1094,7 @@
       <w:pPr>
         <w:numPr>
           <w:ilvl w:val="0"/>
-          <w:numId w:val="14"/>
+          <w:numId w:val="13"/>
         </w:numPr>
       </w:pPr>
       <w:r>
@@ -1124,7 +1115,7 @@
       <w:pPr>
         <w:numPr>
           <w:ilvl w:val="0"/>
-          <w:numId w:val="14"/>
+          <w:numId w:val="13"/>
         </w:numPr>
       </w:pPr>
       <w:r>
@@ -1135,7 +1126,7 @@
       <w:pPr>
         <w:numPr>
           <w:ilvl w:val="0"/>
-          <w:numId w:val="14"/>
+          <w:numId w:val="13"/>
         </w:numPr>
       </w:pPr>
       <w:r>
@@ -1156,7 +1147,7 @@
       <w:pPr>
         <w:numPr>
           <w:ilvl w:val="0"/>
-          <w:numId w:val="14"/>
+          <w:numId w:val="13"/>
         </w:numPr>
       </w:pPr>
       <w:r>
@@ -1167,7 +1158,7 @@
       <w:pPr>
         <w:numPr>
           <w:ilvl w:val="0"/>
-          <w:numId w:val="14"/>
+          <w:numId w:val="13"/>
         </w:numPr>
       </w:pPr>
       <w:r>
@@ -1186,16 +1177,16 @@
         </w:rPr>
         <w:lastRenderedPageBreak/>
         <w:drawing>
-          <wp:inline distT="0" distB="0" distL="0" distR="0" wp14:anchorId="62052D76" wp14:editId="7BADF4CF">
+          <wp:inline distT="0" distB="0" distL="0" distR="0" wp14:anchorId="7449C0C5" wp14:editId="4C7530DD">
             <wp:extent cx="5943600" cy="8229600"/>
             <wp:effectExtent l="0" t="0" r="0" b="0"/>
-            <wp:docPr id="46" name="Picture"/>
+            <wp:docPr id="47" name="Picture"/>
             <wp:cNvGraphicFramePr/>
             <a:graphic xmlns:a="http://schemas.openxmlformats.org/drawingml/2006/main">
               <a:graphicData uri="http://schemas.openxmlformats.org/drawingml/2006/picture">
                 <pic:pic xmlns:pic="http://schemas.openxmlformats.org/drawingml/2006/picture">
                   <pic:nvPicPr>
-                    <pic:cNvPr id="47" name="Picture" descr="images/front_window.png"/>
+                    <pic:cNvPr id="48" name="Picture" descr="images/front_window.png"/>
                     <pic:cNvPicPr>
                       <a:picLocks noChangeAspect="1" noChangeArrowheads="1"/>
                     </pic:cNvPicPr>
@@ -1232,8 +1223,8 @@
       <w:pPr>
         <w:pStyle w:val="Heading1"/>
       </w:pPr>
-      <w:bookmarkStart w:id="11" w:name="front-wall-trim"/>
-      <w:bookmarkEnd w:id="10"/>
+      <w:bookmarkStart w:id="12" w:name="front-wall-trim"/>
+      <w:bookmarkEnd w:id="11"/>
       <w:r>
         <w:lastRenderedPageBreak/>
         <w:t>Front Wall Trim</w:t>
@@ -1252,7 +1243,7 @@
       <w:pPr>
         <w:numPr>
           <w:ilvl w:val="0"/>
-          <w:numId w:val="15"/>
+          <w:numId w:val="14"/>
         </w:numPr>
       </w:pPr>
       <w:r>
@@ -1263,7 +1254,7 @@
       <w:pPr>
         <w:numPr>
           <w:ilvl w:val="0"/>
-          <w:numId w:val="15"/>
+          <w:numId w:val="14"/>
         </w:numPr>
       </w:pPr>
       <w:r>
@@ -1274,7 +1265,7 @@
       <w:pPr>
         <w:numPr>
           <w:ilvl w:val="0"/>
-          <w:numId w:val="15"/>
+          <w:numId w:val="14"/>
         </w:numPr>
       </w:pPr>
       <w:r>
@@ -1301,7 +1292,7 @@
       <w:pPr>
         <w:numPr>
           <w:ilvl w:val="0"/>
-          <w:numId w:val="15"/>
+          <w:numId w:val="14"/>
         </w:numPr>
       </w:pPr>
       <w:r>
@@ -1316,7 +1307,7 @@
       <w:pPr>
         <w:numPr>
           <w:ilvl w:val="0"/>
-          <w:numId w:val="15"/>
+          <w:numId w:val="14"/>
         </w:numPr>
       </w:pPr>
       <w:r>
@@ -1336,7 +1327,7 @@
       <w:pPr>
         <w:numPr>
           <w:ilvl w:val="0"/>
-          <w:numId w:val="16"/>
+          <w:numId w:val="15"/>
         </w:numPr>
       </w:pPr>
       <w:r>
@@ -1347,7 +1338,7 @@
       <w:pPr>
         <w:numPr>
           <w:ilvl w:val="0"/>
-          <w:numId w:val="16"/>
+          <w:numId w:val="15"/>
         </w:numPr>
       </w:pPr>
       <w:r>
@@ -1362,7 +1353,7 @@
       <w:pPr>
         <w:numPr>
           <w:ilvl w:val="0"/>
-          <w:numId w:val="16"/>
+          <w:numId w:val="15"/>
         </w:numPr>
       </w:pPr>
       <w:r>
@@ -1373,7 +1364,7 @@
       <w:pPr>
         <w:numPr>
           <w:ilvl w:val="0"/>
-          <w:numId w:val="16"/>
+          <w:numId w:val="15"/>
         </w:numPr>
       </w:pPr>
       <w:r>
@@ -1384,7 +1375,7 @@
       <w:pPr>
         <w:numPr>
           <w:ilvl w:val="0"/>
-          <w:numId w:val="16"/>
+          <w:numId w:val="15"/>
         </w:numPr>
       </w:pPr>
       <w:r>
@@ -1419,16 +1410,16 @@
         </w:rPr>
         <w:lastRenderedPageBreak/>
         <w:drawing>
-          <wp:inline distT="0" distB="0" distL="0" distR="0" wp14:anchorId="5B95AD72" wp14:editId="182BDF2F">
+          <wp:inline distT="0" distB="0" distL="0" distR="0" wp14:anchorId="46E06C52" wp14:editId="2AA85E0E">
             <wp:extent cx="5943600" cy="8229600"/>
             <wp:effectExtent l="0" t="0" r="0" b="0"/>
-            <wp:docPr id="50" name="Picture"/>
+            <wp:docPr id="51" name="Picture"/>
             <wp:cNvGraphicFramePr/>
             <a:graphic xmlns:a="http://schemas.openxmlformats.org/drawingml/2006/main">
               <a:graphicData uri="http://schemas.openxmlformats.org/drawingml/2006/picture">
                 <pic:pic xmlns:pic="http://schemas.openxmlformats.org/drawingml/2006/picture">
                   <pic:nvPicPr>
-                    <pic:cNvPr id="51" name="Picture" descr="images/front_wall_trim.png"/>
+                    <pic:cNvPr id="52" name="Picture" descr="images/front_wall_trim.png"/>
                     <pic:cNvPicPr>
                       <a:picLocks noChangeAspect="1" noChangeArrowheads="1"/>
                     </pic:cNvPicPr>
@@ -1465,8 +1456,8 @@
       <w:pPr>
         <w:pStyle w:val="Heading1"/>
       </w:pPr>
-      <w:bookmarkStart w:id="12" w:name="final-trim"/>
-      <w:bookmarkEnd w:id="11"/>
+      <w:bookmarkStart w:id="13" w:name="final-trim"/>
+      <w:bookmarkEnd w:id="12"/>
       <w:r>
         <w:lastRenderedPageBreak/>
         <w:t>Final Trim</w:t>
@@ -1476,7 +1467,7 @@
       <w:pPr>
         <w:numPr>
           <w:ilvl w:val="0"/>
-          <w:numId w:val="17"/>
+          <w:numId w:val="16"/>
         </w:numPr>
       </w:pPr>
       <w:r>
@@ -1487,7 +1478,7 @@
       <w:pPr>
         <w:numPr>
           <w:ilvl w:val="0"/>
-          <w:numId w:val="17"/>
+          <w:numId w:val="16"/>
         </w:numPr>
       </w:pPr>
       <w:r>
@@ -1498,7 +1489,7 @@
       <w:pPr>
         <w:numPr>
           <w:ilvl w:val="0"/>
-          <w:numId w:val="17"/>
+          <w:numId w:val="16"/>
         </w:numPr>
       </w:pPr>
       <w:r>
@@ -1509,7 +1500,7 @@
       <w:pPr>
         <w:numPr>
           <w:ilvl w:val="0"/>
-          <w:numId w:val="17"/>
+          <w:numId w:val="16"/>
         </w:numPr>
       </w:pPr>
       <w:r>
@@ -1520,7 +1511,7 @@
       <w:pPr>
         <w:numPr>
           <w:ilvl w:val="0"/>
-          <w:numId w:val="17"/>
+          <w:numId w:val="16"/>
         </w:numPr>
       </w:pPr>
       <w:r>
@@ -1539,16 +1530,16 @@
         </w:rPr>
         <w:lastRenderedPageBreak/>
         <w:drawing>
-          <wp:inline distT="0" distB="0" distL="0" distR="0" wp14:anchorId="661DCFB6" wp14:editId="20B65774">
+          <wp:inline distT="0" distB="0" distL="0" distR="0" wp14:anchorId="182D17E1" wp14:editId="14F9CF95">
             <wp:extent cx="5943600" cy="8229600"/>
             <wp:effectExtent l="0" t="0" r="0" b="0"/>
-            <wp:docPr id="54" name="Picture"/>
+            <wp:docPr id="55" name="Picture"/>
             <wp:cNvGraphicFramePr/>
             <a:graphic xmlns:a="http://schemas.openxmlformats.org/drawingml/2006/main">
               <a:graphicData uri="http://schemas.openxmlformats.org/drawingml/2006/picture">
                 <pic:pic xmlns:pic="http://schemas.openxmlformats.org/drawingml/2006/picture">
                   <pic:nvPicPr>
-                    <pic:cNvPr id="55" name="Picture" descr="images/final_trim.png"/>
+                    <pic:cNvPr id="56" name="Picture" descr="images/final_trim.png"/>
                     <pic:cNvPicPr>
                       <a:picLocks noChangeAspect="1" noChangeArrowheads="1"/>
                     </pic:cNvPicPr>
@@ -1580,7 +1571,7 @@
           </wp:inline>
         </w:drawing>
       </w:r>
-      <w:bookmarkEnd w:id="12"/>
+      <w:bookmarkEnd w:id="13"/>
     </w:p>
     <w:sectPr>
       <w:headerReference w:type="even" r:id="rId15"/>
@@ -1661,7 +1652,7 @@
       <w:rPr>
         <w:noProof/>
       </w:rPr>
-      <w:t>29 January 2025</w:t>
+      <w:t>30 January 2025</w:t>
     </w:r>
     <w:r>
       <w:fldChar w:fldCharType="end"/>
@@ -1764,7 +1755,7 @@
   <w:abstractNum w:abstractNumId="0" w15:restartNumberingAfterBreak="0">
     <w:nsid w:val="0000A990"/>
     <w:multiLevelType w:val="multilevel"/>
-    <w:tmpl w:val="88689960"/>
+    <w:tmpl w:val="03289886"/>
     <w:lvl w:ilvl="0">
       <w:numFmt w:val="bullet"/>
       <w:lvlText w:val=" "/>
@@ -1841,7 +1832,7 @@
   <w:abstractNum w:abstractNumId="1" w15:restartNumberingAfterBreak="0">
     <w:nsid w:val="0000A991"/>
     <w:multiLevelType w:val="multilevel"/>
-    <w:tmpl w:val="F43EA658"/>
+    <w:tmpl w:val="41C0C254"/>
     <w:lvl w:ilvl="0">
       <w:numFmt w:val="bullet"/>
       <w:lvlText w:val=""/>
@@ -1945,7 +1936,7 @@
   <w:abstractNum w:abstractNumId="2" w15:restartNumberingAfterBreak="0">
     <w:nsid w:val="00A99411"/>
     <w:multiLevelType w:val="multilevel"/>
-    <w:tmpl w:val="CB2CCA4C"/>
+    <w:tmpl w:val="5D6A33E0"/>
     <w:lvl w:ilvl="0">
       <w:start w:val="1"/>
       <w:numFmt w:val="decimal"/>
@@ -2031,7 +2022,7 @@
   <w:abstractNum w:abstractNumId="3" w15:restartNumberingAfterBreak="0">
     <w:nsid w:val="00A99415"/>
     <w:multiLevelType w:val="multilevel"/>
-    <w:tmpl w:val="63284E26"/>
+    <w:tmpl w:val="CA1E61D6"/>
     <w:lvl w:ilvl="0">
       <w:start w:val="5"/>
       <w:numFmt w:val="decimal"/>
@@ -2230,13 +2221,13 @@
   <w:num w:numId="1" w16cid:durableId="1603538387">
     <w:abstractNumId w:val="4"/>
   </w:num>
-  <w:num w:numId="2" w16cid:durableId="1364480981">
+  <w:num w:numId="2" w16cid:durableId="382799003">
     <w:abstractNumId w:val="0"/>
   </w:num>
-  <w:num w:numId="3" w16cid:durableId="1443839332">
+  <w:num w:numId="3" w16cid:durableId="1252082609">
     <w:abstractNumId w:val="1"/>
   </w:num>
-  <w:num w:numId="4" w16cid:durableId="36396927">
+  <w:num w:numId="4" w16cid:durableId="995916284">
     <w:abstractNumId w:val="2"/>
     <w:lvlOverride w:ilvl="0">
       <w:startOverride w:val="1"/>
@@ -2266,7 +2257,43 @@
       <w:startOverride w:val="1"/>
     </w:lvlOverride>
   </w:num>
-  <w:num w:numId="5" w16cid:durableId="1682052521">
+  <w:num w:numId="5" w16cid:durableId="1935816221">
+    <w:abstractNumId w:val="1"/>
+  </w:num>
+  <w:num w:numId="6" w16cid:durableId="1949502551">
+    <w:abstractNumId w:val="1"/>
+  </w:num>
+  <w:num w:numId="7" w16cid:durableId="1086270561">
+    <w:abstractNumId w:val="2"/>
+    <w:lvlOverride w:ilvl="0">
+      <w:startOverride w:val="1"/>
+    </w:lvlOverride>
+    <w:lvlOverride w:ilvl="1">
+      <w:startOverride w:val="1"/>
+    </w:lvlOverride>
+    <w:lvlOverride w:ilvl="2">
+      <w:startOverride w:val="1"/>
+    </w:lvlOverride>
+    <w:lvlOverride w:ilvl="3">
+      <w:startOverride w:val="1"/>
+    </w:lvlOverride>
+    <w:lvlOverride w:ilvl="4">
+      <w:startOverride w:val="1"/>
+    </w:lvlOverride>
+    <w:lvlOverride w:ilvl="5">
+      <w:startOverride w:val="1"/>
+    </w:lvlOverride>
+    <w:lvlOverride w:ilvl="6">
+      <w:startOverride w:val="1"/>
+    </w:lvlOverride>
+    <w:lvlOverride w:ilvl="7">
+      <w:startOverride w:val="1"/>
+    </w:lvlOverride>
+    <w:lvlOverride w:ilvl="8">
+      <w:startOverride w:val="1"/>
+    </w:lvlOverride>
+  </w:num>
+  <w:num w:numId="8" w16cid:durableId="283466425">
     <w:abstractNumId w:val="3"/>
     <w:lvlOverride w:ilvl="0">
       <w:startOverride w:val="5"/>
@@ -2296,13 +2323,22 @@
       <w:startOverride w:val="5"/>
     </w:lvlOverride>
   </w:num>
-  <w:num w:numId="6" w16cid:durableId="678309483">
+  <w:num w:numId="9" w16cid:durableId="1891765720">
     <w:abstractNumId w:val="1"/>
   </w:num>
-  <w:num w:numId="7" w16cid:durableId="349263268">
+  <w:num w:numId="10" w16cid:durableId="1820926014">
     <w:abstractNumId w:val="1"/>
   </w:num>
-  <w:num w:numId="8" w16cid:durableId="1864510956">
+  <w:num w:numId="11" w16cid:durableId="1573346609">
+    <w:abstractNumId w:val="1"/>
+  </w:num>
+  <w:num w:numId="12" w16cid:durableId="1600478741">
+    <w:abstractNumId w:val="1"/>
+  </w:num>
+  <w:num w:numId="13" w16cid:durableId="686753211">
+    <w:abstractNumId w:val="1"/>
+  </w:num>
+  <w:num w:numId="14" w16cid:durableId="356468999">
     <w:abstractNumId w:val="2"/>
     <w:lvlOverride w:ilvl="0">
       <w:startOverride w:val="1"/>
@@ -2332,52 +2368,7 @@
       <w:startOverride w:val="1"/>
     </w:lvlOverride>
   </w:num>
-  <w:num w:numId="9" w16cid:durableId="1420445077">
-    <w:abstractNumId w:val="3"/>
-    <w:lvlOverride w:ilvl="0">
-      <w:startOverride w:val="5"/>
-    </w:lvlOverride>
-    <w:lvlOverride w:ilvl="1">
-      <w:startOverride w:val="5"/>
-    </w:lvlOverride>
-    <w:lvlOverride w:ilvl="2">
-      <w:startOverride w:val="5"/>
-    </w:lvlOverride>
-    <w:lvlOverride w:ilvl="3">
-      <w:startOverride w:val="5"/>
-    </w:lvlOverride>
-    <w:lvlOverride w:ilvl="4">
-      <w:startOverride w:val="5"/>
-    </w:lvlOverride>
-    <w:lvlOverride w:ilvl="5">
-      <w:startOverride w:val="5"/>
-    </w:lvlOverride>
-    <w:lvlOverride w:ilvl="6">
-      <w:startOverride w:val="5"/>
-    </w:lvlOverride>
-    <w:lvlOverride w:ilvl="7">
-      <w:startOverride w:val="5"/>
-    </w:lvlOverride>
-    <w:lvlOverride w:ilvl="8">
-      <w:startOverride w:val="5"/>
-    </w:lvlOverride>
-  </w:num>
-  <w:num w:numId="10" w16cid:durableId="1391347714">
-    <w:abstractNumId w:val="1"/>
-  </w:num>
-  <w:num w:numId="11" w16cid:durableId="1640070911">
-    <w:abstractNumId w:val="1"/>
-  </w:num>
-  <w:num w:numId="12" w16cid:durableId="1657029255">
-    <w:abstractNumId w:val="1"/>
-  </w:num>
-  <w:num w:numId="13" w16cid:durableId="1867015455">
-    <w:abstractNumId w:val="1"/>
-  </w:num>
-  <w:num w:numId="14" w16cid:durableId="995378578">
-    <w:abstractNumId w:val="1"/>
-  </w:num>
-  <w:num w:numId="15" w16cid:durableId="530538346">
+  <w:num w:numId="15" w16cid:durableId="280263443">
     <w:abstractNumId w:val="2"/>
     <w:lvlOverride w:ilvl="0">
       <w:startOverride w:val="1"/>
@@ -2407,37 +2398,7 @@
       <w:startOverride w:val="1"/>
     </w:lvlOverride>
   </w:num>
-  <w:num w:numId="16" w16cid:durableId="739396">
-    <w:abstractNumId w:val="2"/>
-    <w:lvlOverride w:ilvl="0">
-      <w:startOverride w:val="1"/>
-    </w:lvlOverride>
-    <w:lvlOverride w:ilvl="1">
-      <w:startOverride w:val="1"/>
-    </w:lvlOverride>
-    <w:lvlOverride w:ilvl="2">
-      <w:startOverride w:val="1"/>
-    </w:lvlOverride>
-    <w:lvlOverride w:ilvl="3">
-      <w:startOverride w:val="1"/>
-    </w:lvlOverride>
-    <w:lvlOverride w:ilvl="4">
-      <w:startOverride w:val="1"/>
-    </w:lvlOverride>
-    <w:lvlOverride w:ilvl="5">
-      <w:startOverride w:val="1"/>
-    </w:lvlOverride>
-    <w:lvlOverride w:ilvl="6">
-      <w:startOverride w:val="1"/>
-    </w:lvlOverride>
-    <w:lvlOverride w:ilvl="7">
-      <w:startOverride w:val="1"/>
-    </w:lvlOverride>
-    <w:lvlOverride w:ilvl="8">
-      <w:startOverride w:val="1"/>
-    </w:lvlOverride>
-  </w:num>
-  <w:num w:numId="17" w16cid:durableId="526408733">
+  <w:num w:numId="16" w16cid:durableId="1188788762">
     <w:abstractNumId w:val="2"/>
     <w:lvlOverride w:ilvl="0">
       <w:startOverride w:val="1"/>
@@ -2919,6 +2880,50 @@
       <w:szCs w:val="36"/>
     </w:rPr>
   </w:style>
+  <w:style w:type="paragraph" w:styleId="Heading3">
+    <w:name w:val="heading 3"/>
+    <w:basedOn w:val="Normal"/>
+    <w:next w:val="Normal"/>
+    <w:link w:val="Heading3Char"/>
+    <w:uiPriority w:val="9"/>
+    <w:unhideWhenUsed/>
+    <w:qFormat/>
+    <w:rsid w:val="005B3D4E"/>
+    <w:pPr>
+      <w:keepNext/>
+      <w:keepLines/>
+      <w:spacing w:before="40" w:after="0"/>
+      <w:outlineLvl w:val="2"/>
+    </w:pPr>
+    <w:rPr>
+      <w:rFonts w:ascii="Arial" w:eastAsiaTheme="majorEastAsia" w:hAnsi="Arial" w:cstheme="majorBidi"/>
+      <w:color w:val="243F60" w:themeColor="accent1" w:themeShade="7F"/>
+      <w:sz w:val="32"/>
+      <w:szCs w:val="24"/>
+    </w:rPr>
+  </w:style>
+  <w:style w:type="paragraph" w:styleId="Heading4">
+    <w:name w:val="heading 4"/>
+    <w:basedOn w:val="Normal"/>
+    <w:next w:val="Normal"/>
+    <w:link w:val="Heading4Char"/>
+    <w:uiPriority w:val="9"/>
+    <w:unhideWhenUsed/>
+    <w:qFormat/>
+    <w:rsid w:val="005B3D4E"/>
+    <w:pPr>
+      <w:keepNext/>
+      <w:keepLines/>
+      <w:spacing w:before="40" w:after="0"/>
+      <w:outlineLvl w:val="3"/>
+    </w:pPr>
+    <w:rPr>
+      <w:rFonts w:asciiTheme="majorHAnsi" w:eastAsiaTheme="majorEastAsia" w:hAnsiTheme="majorHAnsi" w:cstheme="majorBidi"/>
+      <w:i/>
+      <w:iCs/>
+      <w:color w:val="365F91" w:themeColor="accent1" w:themeShade="BF"/>
+    </w:rPr>
+  </w:style>
   <w:style w:type="character" w:default="1" w:styleId="DefaultParagraphFont">
     <w:name w:val="Default Paragraph Font"/>
     <w:uiPriority w:val="1"/>
@@ -3107,6 +3112,32 @@
       <w:ind w:left="720"/>
       <w:contextualSpacing/>
     </w:pPr>
+  </w:style>
+  <w:style w:type="character" w:customStyle="1" w:styleId="Heading3Char">
+    <w:name w:val="Heading 3 Char"/>
+    <w:basedOn w:val="DefaultParagraphFont"/>
+    <w:link w:val="Heading3"/>
+    <w:uiPriority w:val="9"/>
+    <w:rsid w:val="005B3D4E"/>
+    <w:rPr>
+      <w:rFonts w:ascii="Arial" w:eastAsiaTheme="majorEastAsia" w:hAnsi="Arial" w:cstheme="majorBidi"/>
+      <w:color w:val="243F60" w:themeColor="accent1" w:themeShade="7F"/>
+      <w:sz w:val="32"/>
+      <w:szCs w:val="24"/>
+    </w:rPr>
+  </w:style>
+  <w:style w:type="character" w:customStyle="1" w:styleId="Heading4Char">
+    <w:name w:val="Heading 4 Char"/>
+    <w:basedOn w:val="DefaultParagraphFont"/>
+    <w:link w:val="Heading4"/>
+    <w:uiPriority w:val="9"/>
+    <w:rsid w:val="005B3D4E"/>
+    <w:rPr>
+      <w:rFonts w:asciiTheme="majorHAnsi" w:eastAsiaTheme="majorEastAsia" w:hAnsiTheme="majorHAnsi" w:cstheme="majorBidi"/>
+      <w:i/>
+      <w:iCs/>
+      <w:color w:val="365F91" w:themeColor="accent1" w:themeShade="BF"/>
+    </w:rPr>
   </w:style>
   <w:style w:type="paragraph" w:customStyle="1" w:styleId="SourceCode">
     <w:name w:val="Source Code"/>

</xml_diff>

<commit_message>
Minor revisions for clarity
</commit_message>
<xml_diff>
--- a/Interior_Trim/interior_trim.docx
+++ b/Interior_Trim/interior_trim.docx
@@ -1601,7 +1601,7 @@
         </w:numPr>
       </w:pPr>
       <w:r>
-        <w:t xml:space="preserve">Measure the height on the front wall behind the door from upper trim to the baseboard. Check that the narrow board from step 3 will span from the center of the door jamb to within 3/8” of the wall.</w:t>
+        <w:t xml:space="preserve">Measure the height on the front wall behind the door from upper trim to the baseboard. Check that the narrow board from step 3 will span from the center of the door jamb to within 3/8” of the wall. If it is too narrow, cut and install the piece in the next step first.</w:t>
       </w:r>
       <w:r>
         <w:br/>
@@ -1692,7 +1692,7 @@
         </w:numPr>
       </w:pPr>
       <w:r>
-        <w:t xml:space="preserve">Measure above the door from the sidewall trim to the 5½” board. Cut 2” trim and nail in place.</w:t>
+        <w:t xml:space="preserve">Measure above the door from the sidewall trim to the 5½” board. Cut 2” trim and nail in place over the door, and with the bottom edge halfway over the door frame.</w:t>
       </w:r>
     </w:p>
     <w:p>
@@ -1703,7 +1703,7 @@
         </w:numPr>
       </w:pPr>
       <w:r>
-        <w:t xml:space="preserve">Install 2” trim on the top and wall-side of the front window flush with window opening liner</w:t>
+        <w:t xml:space="preserve">Measure, cut, and install 2” trim on the top and wall-side of the front window flush with window opening liner</w:t>
       </w:r>
       <w:r>
         <w:br/>
@@ -1748,13 +1748,13 @@
         <w:br/>
       </w:r>
       <w:r>
-        <w:t xml:space="preserve">— Use remaining trim pieces saved after rear wall triangle trim</w:t>
+        <w:t xml:space="preserve">— Use remaining trim pieces saved after rear wall triangle trim.</w:t>
       </w:r>
       <w:r>
         <w:br/>
       </w:r>
       <w:r>
-        <w:t xml:space="preserve">— Position the angled pieces and nail to the front wall</w:t>
+        <w:t xml:space="preserve">— Position the angled pieces and nail to the front wall.</w:t>
       </w:r>
       <w:r>
         <w:br/>
@@ -1840,7 +1840,7 @@
         </w:numPr>
       </w:pPr>
       <w:r>
-        <w:t xml:space="preserve">Measure, cut, and place the final horizontal trim piece on the middle seam of the side wall</w:t>
+        <w:t xml:space="preserve">Measure, cut, and place the final horizontal trim piece on the middle seam of one side wall</w:t>
       </w:r>
     </w:p>
     <w:p>
@@ -1870,7 +1870,7 @@
         <w:t xml:space="preserve"> </w:t>
       </w:r>
       <w:r>
-        <w:t xml:space="preserve">shelf, align with the horizontal trim at waist level on the side wall. USE a LEVEL, nail</w:t>
+        <w:t xml:space="preserve">shelf, align with the horizontal trim at waist level on the side wall. USE a LEVEL, nail in place.</w:t>
       </w:r>
     </w:p>
     <w:p>

</xml_diff>

<commit_message>
Changes to baseboard installation; minor formatting
</commit_message>
<xml_diff>
--- a/Interior_Trim/interior_trim.docx
+++ b/Interior_Trim/interior_trim.docx
@@ -59,29 +59,6 @@
         </w:numPr>
       </w:pPr>
       <w:r>
-        <w:t xml:space="preserve">Place small pieces of flooring as spacers for baseboards</w:t>
-      </w:r>
-      <w:r>
-        <w:br/>
-      </w:r>
-      <w:r>
-        <w:t xml:space="preserve">— located at station 4</w:t>
-      </w:r>
-      <w:r>
-        <w:br/>
-      </w:r>
-      <w:r>
-        <w:t xml:space="preserve">— around the perimeter to lift the baseboards up off the floor</w:t>
-      </w:r>
-    </w:p>
-    <w:p>
-      <w:pPr>
-        <w:numPr>
-          <w:ilvl w:val="0"/>
-          <w:numId w:val="1001"/>
-        </w:numPr>
-      </w:pPr>
-      <w:r>
         <w:t xml:space="preserve">Use</w:t>
       </w:r>
       <w:r>
@@ -180,7 +157,16 @@
         </w:numPr>
       </w:pPr>
       <w:r>
-        <w:t xml:space="preserve">Measure along a sidewall from back to front. Using long 4” white baseboards, cut a piece this length and nail in place to the side wall. Be sure that the baseboard rests on several spacers along its length, to assure an even gap above the finished floor.</w:t>
+        <w:t xml:space="preserve">Measure along a sidewall from back to front. Using long 4” white baseboards, cut a piece this length and nail in place to the side wall. Use a putty knife under the baseboard to provide a small space between the baseboard and the floor, so that the flooring can</w:t>
+      </w:r>
+      <w:r>
+        <w:t xml:space="preserve"> </w:t>
+      </w:r>
+      <w:r>
+        <w:t xml:space="preserve">“float”</w:t>
+      </w:r>
+      <w:r>
+        <w:t xml:space="preserve">.</w:t>
       </w:r>
     </w:p>
     <w:p>
@@ -1840,7 +1826,7 @@
         </w:numPr>
       </w:pPr>
       <w:r>
-        <w:t xml:space="preserve">Measure, cut, and place the final horizontal trim piece on the middle seam of one side wall</w:t>
+        <w:t xml:space="preserve">Measure, cut, and place the final horizontal trim piece in the middle of one side wall, lining it up with the long middle trim on that wall.</w:t>
       </w:r>
     </w:p>
     <w:p>
@@ -1972,7 +1958,7 @@
       <w:pgSz w:code="1" w:h="15840" w:w="12240"/>
       <w:pgMar w:bottom="1440" w:footer="708" w:gutter="0" w:header="708" w:left="1440" w:right="1440" w:top="1440"/>
       <w:cols w:space="708"/>
-      <w:docGrid w:linePitch="360"/>
+      <w:docGrid w:linePitch="381"/>
     </w:sectPr>
   </w:body>
 </w:document>
@@ -1998,7 +1984,7 @@
     <w:pPr>
       <w:pStyle w:val="Footer"/>
       <w:pBdr>
-        <w:top w:val="single" w:sz="4" w:space="1" w:color="BFBFBF" w:themeColor="background1" w:themeShade="BF"/>
+        <w:top w:val="single" w:sz="4" w:space="1" w:color="auto"/>
       </w:pBdr>
       <w:rPr>
         <w:sz w:val="22"/>
@@ -2015,6 +2001,12 @@
         <w:sz w:val="22"/>
       </w:rPr>
       <w:ptab w:relativeTo="margin" w:alignment="center" w:leader="none"/>
+    </w:r>
+    <w:r>
+      <w:rPr>
+        <w:sz w:val="22"/>
+      </w:rPr>
+      <w:t xml:space="preserve"> </w:t>
     </w:r>
     <w:r>
       <w:rPr>
@@ -2039,13 +2031,19 @@
         <w:noProof/>
         <w:sz w:val="22"/>
       </w:rPr>
-      <w:t>30 January 2025</w:t>
+      <w:t>12 March 2025</w:t>
     </w:r>
     <w:r>
       <w:rPr>
         <w:sz w:val="22"/>
       </w:rPr>
       <w:fldChar w:fldCharType="end"/>
+    </w:r>
+    <w:r>
+      <w:rPr>
+        <w:sz w:val="22"/>
+      </w:rPr>
+      <w:t xml:space="preserve"> </w:t>
     </w:r>
     <w:r>
       <w:rPr>
@@ -2080,7 +2078,6 @@
     </w:r>
     <w:r>
       <w:rPr>
-        <w:noProof/>
         <w:sz w:val="22"/>
       </w:rPr>
       <w:fldChar w:fldCharType="end"/>
@@ -2153,10 +2150,11 @@
   <w:abstractNum w15:restartNumberingAfterBreak="0" w:abstractNumId="0">
     <w:nsid w:val="5BCE4232"/>
     <w:multiLevelType w:val="hybridMultilevel"/>
-    <w:tmpl w:val="622EFD06"/>
-    <w:lvl w:ilvl="0" w:tplc="0C090001">
+    <w:tmpl w:val="C14AE192"/>
+    <w:lvl w:ilvl="0" w:tplc="4A0AC008">
       <w:start w:val="1"/>
       <w:numFmt w:val="bullet"/>
+      <w:pStyle w:val="ListParagraph"/>
       <w:lvlText w:val=""/>
       <w:lvlJc w:val="left"/>
       <w:pPr>
@@ -2612,7 +2610,7 @@
       </w:pPr>
     </w:lvl>
   </w:abstractNum>
-  <w:num w16cid:durableId="1603538387" w:numId="1">
+  <w:num w16cid:durableId="101804748" w:numId="1">
     <w:abstractNumId w:val="0"/>
   </w:num>
   <w:num w:numId="1000">
@@ -2622,34 +2620,7 @@
     <w:abstractNumId w:val="991"/>
   </w:num>
   <w:num w:numId="1002">
-    <w:abstractNumId w:val="99411"/>
-    <w:lvlOverride w:ilvl="0">
-      <w:startOverride w:val="1"/>
-    </w:lvlOverride>
-    <w:lvlOverride w:ilvl="1">
-      <w:startOverride w:val="1"/>
-    </w:lvlOverride>
-    <w:lvlOverride w:ilvl="2">
-      <w:startOverride w:val="1"/>
-    </w:lvlOverride>
-    <w:lvlOverride w:ilvl="3">
-      <w:startOverride w:val="1"/>
-    </w:lvlOverride>
-    <w:lvlOverride w:ilvl="4">
-      <w:startOverride w:val="1"/>
-    </w:lvlOverride>
-    <w:lvlOverride w:ilvl="5">
-      <w:startOverride w:val="1"/>
-    </w:lvlOverride>
-    <w:lvlOverride w:ilvl="6">
-      <w:startOverride w:val="1"/>
-    </w:lvlOverride>
-    <w:lvlOverride w:ilvl="7">
-      <w:startOverride w:val="1"/>
-    </w:lvlOverride>
-    <w:lvlOverride w:ilvl="8">
-      <w:startOverride w:val="1"/>
-    </w:lvlOverride>
+    <w:abstractNumId w:val="991"/>
   </w:num>
   <w:num w:numId="1003">
     <w:abstractNumId w:val="991"/>
@@ -3223,7 +3194,7 @@
   <w:style w:default="1" w:styleId="Normal" w:type="paragraph">
     <w:name w:val="Normal"/>
     <w:qFormat/>
-    <w:rsid w:val="0033722B"/>
+    <w:rsid w:val="00682500"/>
     <w:rPr>
       <w:sz w:val="28"/>
     </w:rPr>
@@ -3262,7 +3233,7 @@
     <w:uiPriority w:val="9"/>
     <w:unhideWhenUsed/>
     <w:qFormat/>
-    <w:rsid w:val="00F14C3E"/>
+    <w:rsid w:val="00B467BA"/>
     <w:pPr>
       <w:keepNext/>
       <w:keepLines/>
@@ -3286,11 +3257,11 @@
     <w:uiPriority w:val="9"/>
     <w:unhideWhenUsed/>
     <w:qFormat/>
-    <w:rsid w:val="005B3D4E"/>
+    <w:rsid w:val="001716AF"/>
     <w:pPr>
       <w:keepNext/>
       <w:keepLines/>
-      <w:spacing w:after="0" w:before="40"/>
+      <w:spacing w:after="0" w:before="120"/>
       <w:outlineLvl w:val="2"/>
     </w:pPr>
     <w:rPr>
@@ -3308,18 +3279,17 @@
     <w:uiPriority w:val="9"/>
     <w:unhideWhenUsed/>
     <w:qFormat/>
-    <w:rsid w:val="005B3D4E"/>
+    <w:rsid w:val="001716AF"/>
     <w:pPr>
       <w:keepNext/>
       <w:keepLines/>
-      <w:spacing w:after="0" w:before="40"/>
+      <w:spacing w:after="0"/>
       <w:outlineLvl w:val="3"/>
     </w:pPr>
     <w:rPr>
-      <w:rFonts w:asciiTheme="majorHAnsi" w:cstheme="majorBidi" w:eastAsiaTheme="majorEastAsia" w:hAnsiTheme="majorHAnsi"/>
-      <w:i/>
+      <w:rFonts w:ascii="Arial" w:cs="Arial" w:eastAsiaTheme="majorEastAsia" w:hAnsi="Arial"/>
+      <w:bCs/>
       <w:iCs/>
-      <w:color w:themeColor="accent1" w:themeShade="BF" w:val="365F91"/>
     </w:rPr>
   </w:style>
   <w:style w:default="1" w:styleId="DefaultParagraphFont" w:type="character">
@@ -3355,7 +3325,7 @@
     <w:link w:val="HeaderChar"/>
     <w:uiPriority w:val="99"/>
     <w:unhideWhenUsed/>
-    <w:rsid w:val="00E043FD"/>
+    <w:rsid w:val="00037B15"/>
     <w:pPr>
       <w:tabs>
         <w:tab w:pos="4513" w:val="center"/>
@@ -3370,6 +3340,9 @@
     <w:link w:val="Header"/>
     <w:uiPriority w:val="99"/>
     <w:rsid w:val="00E043FD"/>
+    <w:rPr>
+      <w:sz w:val="28"/>
+    </w:rPr>
   </w:style>
   <w:style w:styleId="Footer" w:type="paragraph">
     <w:name w:val="footer"/>
@@ -3377,7 +3350,7 @@
     <w:link w:val="FooterChar"/>
     <w:uiPriority w:val="99"/>
     <w:unhideWhenUsed/>
-    <w:rsid w:val="00E043FD"/>
+    <w:rsid w:val="00037B15"/>
     <w:pPr>
       <w:tabs>
         <w:tab w:pos="4513" w:val="center"/>
@@ -3392,6 +3365,9 @@
     <w:link w:val="Footer"/>
     <w:uiPriority w:val="99"/>
     <w:rsid w:val="00E043FD"/>
+    <w:rPr>
+      <w:sz w:val="28"/>
+    </w:rPr>
   </w:style>
   <w:style w:customStyle="1" w:styleId="3CBD5A742C28424DA5172AD252E32316" w:type="paragraph">
     <w:name w:val="3CBD5A742C28424DA5172AD252E32316"/>
@@ -3490,7 +3466,7 @@
     <w:basedOn w:val="DefaultParagraphFont"/>
     <w:link w:val="Heading2"/>
     <w:uiPriority w:val="9"/>
-    <w:rsid w:val="00F14C3E"/>
+    <w:rsid w:val="00B467BA"/>
     <w:rPr>
       <w:rFonts w:cstheme="minorHAnsi" w:eastAsiaTheme="majorEastAsia"/>
       <w:b/>
@@ -3503,11 +3479,15 @@
   <w:style w:styleId="ListParagraph" w:type="paragraph">
     <w:name w:val="List Paragraph"/>
     <w:basedOn w:val="Normal"/>
+    <w:link w:val="ListParagraphChar"/>
     <w:uiPriority w:val="34"/>
     <w:qFormat/>
-    <w:rsid w:val="0085261D"/>
+    <w:rsid w:val="002E72C0"/>
     <w:pPr>
-      <w:ind w:left="720"/>
+      <w:numPr>
+        <w:numId w:val="1"/>
+      </w:numPr>
+      <w:spacing w:after="120"/>
       <w:contextualSpacing/>
     </w:pPr>
   </w:style>
@@ -3516,7 +3496,7 @@
     <w:basedOn w:val="DefaultParagraphFont"/>
     <w:link w:val="Heading3"/>
     <w:uiPriority w:val="9"/>
-    <w:rsid w:val="005B3D4E"/>
+    <w:rsid w:val="001716AF"/>
     <w:rPr>
       <w:rFonts w:ascii="Arial" w:cstheme="majorBidi" w:eastAsiaTheme="majorEastAsia" w:hAnsi="Arial"/>
       <w:color w:themeColor="accent1" w:themeShade="7F" w:val="243F60"/>
@@ -3529,22 +3509,61 @@
     <w:basedOn w:val="DefaultParagraphFont"/>
     <w:link w:val="Heading4"/>
     <w:uiPriority w:val="9"/>
-    <w:rsid w:val="005B3D4E"/>
-    <w:rPr>
-      <w:rFonts w:asciiTheme="majorHAnsi" w:cstheme="majorBidi" w:eastAsiaTheme="majorEastAsia" w:hAnsiTheme="majorHAnsi"/>
-      <w:i/>
+    <w:rsid w:val="001716AF"/>
+    <w:rPr>
+      <w:rFonts w:ascii="Arial" w:cs="Arial" w:eastAsiaTheme="majorEastAsia" w:hAnsi="Arial"/>
+      <w:bCs/>
       <w:iCs/>
-      <w:color w:themeColor="accent1" w:themeShade="BF" w:val="365F91"/>
+      <w:sz w:val="28"/>
     </w:rPr>
   </w:style>
   <w:style w:styleId="NoSpacing" w:type="paragraph">
     <w:name w:val="No Spacing"/>
     <w:uiPriority w:val="1"/>
     <w:qFormat/>
-    <w:rsid w:val="0033722B"/>
+    <w:rsid w:val="00037B15"/>
     <w:pPr>
       <w:spacing w:after="0" w:line="240" w:lineRule="auto"/>
     </w:pPr>
+    <w:rPr>
+      <w:sz w:val="28"/>
+    </w:rPr>
+  </w:style>
+  <w:style w:styleId="Revision" w:type="paragraph">
+    <w:name w:val="Revision"/>
+    <w:hidden/>
+    <w:uiPriority w:val="99"/>
+    <w:semiHidden/>
+    <w:rsid w:val="00037B15"/>
+    <w:pPr>
+      <w:spacing w:after="0" w:line="240" w:lineRule="auto"/>
+    </w:pPr>
+  </w:style>
+  <w:style w:customStyle="1" w:styleId="Bulleted" w:type="paragraph">
+    <w:name w:val="Bulleted"/>
+    <w:basedOn w:val="ListParagraph"/>
+    <w:link w:val="BulletedChar"/>
+    <w:qFormat/>
+    <w:rsid w:val="006E24A1"/>
+    <w:pPr>
+      <w:spacing w:after="0"/>
+    </w:pPr>
+  </w:style>
+  <w:style w:customStyle="1" w:styleId="ListParagraphChar" w:type="character">
+    <w:name w:val="List Paragraph Char"/>
+    <w:basedOn w:val="DefaultParagraphFont"/>
+    <w:link w:val="ListParagraph"/>
+    <w:uiPriority w:val="34"/>
+    <w:rsid w:val="006E24A1"/>
+    <w:rPr>
+      <w:sz w:val="28"/>
+    </w:rPr>
+  </w:style>
+  <w:style w:customStyle="1" w:styleId="BulletedChar" w:type="character">
+    <w:name w:val="Bulleted Char"/>
+    <w:basedOn w:val="ListParagraphChar"/>
+    <w:link w:val="Bulleted"/>
+    <w:rsid w:val="006E24A1"/>
     <w:rPr>
       <w:sz w:val="28"/>
     </w:rPr>

</xml_diff>